<commit_message>
Open reproducibility: record-level data archived in releases; portable script paths
- Data availability statements (manuscript EN/ZH, cover letter, README,
  both web pages) now point to the public repository, with the record-
  level China Birdwatching Record Center dataset in the releases
- Scripts 10-11 read from data_raw/ when present (release download),
  falling back to local project paths; README documents the download
  and checksum steps
</commit_message>
<xml_diff>
--- a/submission/04_Technical_Comment_中文版.docx
+++ b/submission/04_Technical_Comment_中文版.docx
@@ -2169,7 +2169,25 @@
         <w:rPr>
           <w:rFonts w:hint="eastAsia"/>
         </w:rPr>
-        <w:t xml:space="preserve">脚本及派生数据表,可应编辑与审稿人要求提供,并将在接收后以</w:t>
+        <w:t xml:space="preserve">脚本及派生数据表已公开于</w:t>
+      </w:r>
+      <w:r>
+        <w:t xml:space="preserve"> </w:t>
+      </w:r>
+      <w:r>
+        <w:rPr>
+          <w:rFonts w:hint="eastAsia"/>
+        </w:rPr>
+        <w:t xml:space="preserve">github.com/dingchenchen6/reanalysis-zhang2026-solar-birds;用于物种级核验的观鸟记录中心记录级数据集存档于该仓库的</w:t>
+      </w:r>
+      <w:r>
+        <w:t xml:space="preserve"> </w:t>
+      </w:r>
+      <w:r>
+        <w:rPr>
+          <w:rFonts w:hint="eastAsia"/>
+        </w:rPr>
+        <w:t xml:space="preserve">Releases。全部档案将在接收后以</w:t>
       </w:r>
       <w:r>
         <w:t xml:space="preserve"> DOI </w:t>
@@ -2178,7 +2196,7 @@
         <w:rPr>
           <w:rFonts w:hint="eastAsia"/>
         </w:rPr>
-        <w:t xml:space="preserve">形式公开存档。用于物种级核验的记录级观鸟平台数据依数据协议持有;其汇总核验结果随文提供。</w:t>
+        <w:t xml:space="preserve">形式存档。</w:t>
       </w:r>
       <w:r>
         <w:rPr>

</xml_diff>